<commit_message>
feat(pdf): incorporar dbt antes de SQL (MySQL) en Habilidades Tecnicas y Competencias en PDF español e ingles
</commit_message>
<xml_diff>
--- a/CV_Ruben_Barrios_Analista_De_Datos.docx
+++ b/CV_Ruben_Barrios_Analista_De_Datos.docx
@@ -65,7 +65,7 @@
           <w:color w:val="1D4ED8"/>
           <w:sz w:val="18"/>
         </w:rPr>
-        <w:t xml:space="preserve">LinkedIn: linkedin.com/in/ruben-barrios-1430712ab | GitHub: github.com/rubenbarrios-bigdata | CV Web: rubenbarrios-bigdata.github.io/cv-ejecutivo-inteligente/</w:t>
+        <w:t xml:space="preserve">LinkedIn: linkedin.com/in/ruben-barrios-1430712ab | GitHub: github.com/rubenbarrios-bigdata | CV Web: rubenbarrios-bigdata.github.io/CV-Portfolio/</w:t>
       </w:r>
     </w:p>
     <w:p>
@@ -260,7 +260,7 @@
           <w:color w:val="111827"/>
           <w:sz w:val="19"/>
         </w:rPr>
-        <w:t xml:space="preserve"> Power BI (DAX avanzado, Power Query, modelado dimensional, PBIP), SQL (MySQL, PostgreSQL: queries complejas, subconsultas, agregaciones), Python (pandas, NumPy, Matplotlib, Colab, VSCode), Excel avanzado (tablas dinámicas, fórmulas avanzadas, dashboard ejecutivo).</w:t>
+        <w:t xml:space="preserve"> Power BI (DAX avanzado, Power Query, modelado dimensional, PBIP), dbt, SQL (MySQL, PostgreSQL: queries complejas, subconsultas, agregaciones), Python (pandas, NumPy, Matplotlib, Colab, VSCode), Excel avanzado (tablas dinámicas, fórmulas avanzadas, dashboard ejecutivo).</w:t>
       </w:r>
     </w:p>
     <w:p>

</xml_diff>